<commit_message>
Trim repository to assignment deliverables
Remove report-generation tooling and the diagram source, rename the
guided demo to scripts/demo_walkthrough.sh, and rebuild the report with
the real repository URL.

Co-Authored-By: Claude Opus 5.5 <noreply@anthropic.com>
Claude-Session: https://claude.ai/code/session_015X6yHcBbu8KpjQt5EJdqxZ
</commit_message>
<xml_diff>
--- a/report/MLOps_Assignment1_Report_2025AE05523.docx
+++ b/report/MLOps_Assignment1_Report_2025AE05523.docx
@@ -112,14 +112,14 @@
         </w:rPr>
         <w:t xml:space="preserve">Code repository: </w:t>
       </w:r>
-      <w:hyperlink w:history="1" r:id="rIdp1w5-zadrlaugwmxdpjgn">
+      <w:hyperlink w:history="1" r:id="rIdihjghgr1_qdssc23z4wcg">
         <w:r>
           <w:rPr>
             <w:rStyle w:val="Hyperlink"/>
             <w:sz w:val="22"/>
             <w:szCs w:val="22"/>
           </w:rPr>
-          <w:t xml:space="preserve">https://github.com/&lt;your-github-username&gt;/heart-disease-mlops</w:t>
+          <w:t xml:space="preserve">https://github.com/mrshankar/heart-disease-mlops</w:t>
         </w:r>
       </w:hyperlink>
     </w:p>
@@ -5045,7 +5045,7 @@
           <w:sz w:val="19"/>
           <w:szCs w:val="19"/>
         </w:rPr>
-        <w:t xml:space="preserve">CI evidence: after pushing the repository, add screenshots of the Actions run graph and job summaries here (screenshots/02_ci_pipeline.png, 02b_ci_summary.png). The workflow was validated locally (YAML structure test, every command run by hand), but it has not yet run on GitHub.</w:t>
+        <w:t xml:space="preserve">CI evidence: insert screenshots of the GitHub Actions run here (Actions tab: run graph and job summaries), saved as screenshots/02_ci_pipeline.png and screenshots/02b_ci_summary.png.</w:t>
       </w:r>
     </w:p>
     <w:p>
@@ -5776,7 +5776,7 @@
                 <w:sz w:val="18"/>
                 <w:szCs w:val="18"/>
               </w:rPr>
-              <w:t xml:space="preserve">https://github.com/&lt;your-github-username&gt;/heart-disease-mlops</w:t>
+              <w:t xml:space="preserve">https://github.com/mrshankar/heart-disease-mlops</w:t>
             </w:r>
           </w:p>
         </w:tc>
@@ -6161,7 +6161,7 @@
                 <w:sz w:val="18"/>
                 <w:szCs w:val="18"/>
               </w:rPr>
-              <w:t xml:space="preserve">Video</w:t>
+              <w:t xml:space="preserve">Demo video</w:t>
             </w:r>
           </w:p>
         </w:tc>
@@ -6190,7 +6190,7 @@
                 <w:sz w:val="18"/>
                 <w:szCs w:val="18"/>
               </w:rPr>
-              <w:t xml:space="preserve">report/VIDEO_SCRIPT.md (recording walkthrough)</w:t>
+              <w:t xml:space="preserve">link to the recording (add before submission)</w:t>
             </w:r>
           </w:p>
         </w:tc>

</xml_diff>

<commit_message>
Add demo video and link it from the README and report
Co-Authored-By: Claude Opus 5.5 <noreply@anthropic.com>
Claude-Session: https://claude.ai/code/session_015X6yHcBbu8KpjQt5EJdqxZ
</commit_message>
<xml_diff>
--- a/report/MLOps_Assignment1_Report_2025AE05523.docx
+++ b/report/MLOps_Assignment1_Report_2025AE05523.docx
@@ -112,7 +112,7 @@
         </w:rPr>
         <w:t xml:space="preserve">Code repository: </w:t>
       </w:r>
-      <w:hyperlink w:history="1" r:id="rIdihjghgr1_qdssc23z4wcg">
+      <w:hyperlink w:history="1" r:id="rId2samtsioipegcg5m34rw-">
         <w:r>
           <w:rPr>
             <w:rStyle w:val="Hyperlink"/>
@@ -6190,7 +6190,7 @@
                 <w:sz w:val="18"/>
                 <w:szCs w:val="18"/>
               </w:rPr>
-              <w:t xml:space="preserve">link to the recording (add before submission)</w:t>
+              <w:t xml:space="preserve">report/MLOps_Assignment1_Demo.mp4 (about 10 min) - https://github.com/mrshankar/heart-disease-mlops/blob/main/report/MLOps_Assignment1_Demo.mp4</w:t>
             </w:r>
           </w:p>
         </w:tc>

</xml_diff>

<commit_message>
Report: replace CI placeholder note with link to the Actions run history
Co-Authored-By: Claude Opus 5.5 <noreply@anthropic.com>
Claude-Session: https://claude.ai/code/session_015X6yHcBbu8KpjQt5EJdqxZ
</commit_message>
<xml_diff>
--- a/report/MLOps_Assignment1_Report_2025AE05523.docx
+++ b/report/MLOps_Assignment1_Report_2025AE05523.docx
@@ -112,7 +112,7 @@
         </w:rPr>
         <w:t xml:space="preserve">Code repository: </w:t>
       </w:r>
-      <w:hyperlink w:history="1" r:id="rId2samtsioipegcg5m34rw-">
+      <w:hyperlink w:history="1" r:id="rIdfagxpe_za3lm2jm7brotw">
         <w:r>
           <w:rPr>
             <w:rStyle w:val="Hyperlink"/>
@@ -5033,19 +5033,21 @@
     </w:p>
     <w:p>
       <w:pPr>
-        <w:pBdr>
-          <w:left w:val="single" w:color="E0A030" w:sz="18" w:space="8"/>
-        </w:pBdr>
-        <w:shd w:fill="FFF7E6" w:color="auto" w:val="clear"/>
-        <w:spacing w:after="140" w:before="80"/>
-        <w:ind w:left="120"/>
-      </w:pPr>
-      <w:r>
-        <w:rPr>
-          <w:sz w:val="19"/>
-          <w:szCs w:val="19"/>
-        </w:rPr>
-        <w:t xml:space="preserve">CI evidence: insert screenshots of the GitHub Actions run here (Actions tab: run graph and job summaries), saved as screenshots/02_ci_pipeline.png and screenshots/02b_ci_summary.png.</w:t>
+        <w:spacing w:after="100" w:line="276"/>
+      </w:pPr>
+      <w:r>
+        <w:t xml:space="preserve">The workflow runs automatically on every push to main. The run history, job graphs, step logs and uploaded artifacts of every run are public on the repository's Actions page: </w:t>
+      </w:r>
+      <w:hyperlink w:history="1" r:id="rId042ncxepigam2l3hkvnzi">
+        <w:r>
+          <w:rPr>
+            <w:rStyle w:val="Hyperlink"/>
+          </w:rPr>
+          <w:t xml:space="preserve">https://github.com/mrshankar/heart-disease-mlops/actions</w:t>
+        </w:r>
+      </w:hyperlink>
+      <w:r>
+        <w:t xml:space="preserve">.</w:t>
       </w:r>
     </w:p>
     <w:p>

</xml_diff>

<commit_message>
Report: Figures 11-12 from the Prayogshala VM run (96% coverage)
Co-Authored-By: Claude Opus 5.5 <noreply@anthropic.com>
Claude-Session: https://claude.ai/code/session_015X6yHcBbu8KpjQt5EJdqxZ
</commit_message>
<xml_diff>
--- a/report/MLOps_Assignment1_Report_2025AE05523.docx
+++ b/report/MLOps_Assignment1_Report_2025AE05523.docx
@@ -112,7 +112,7 @@
         </w:rPr>
         <w:t xml:space="preserve">Code repository: </w:t>
       </w:r>
-      <w:hyperlink w:history="1" r:id="rIdfagxpe_za3lm2jm7brotw">
+      <w:hyperlink w:history="1" r:id="rIdaoqzvvkpjxyl7joqw5lkh">
         <w:r>
           <w:rPr>
             <w:rStyle w:val="Hyperlink"/>
@@ -587,7 +587,7 @@
                 <w:sz w:val="18"/>
                 <w:szCs w:val="18"/>
               </w:rPr>
-              <w:t xml:space="preserve">50 pytest tests, 97% line coverage, flake8 clean; clean-environment install verified</w:t>
+              <w:t xml:space="preserve">50 pytest tests, 96% line coverage, flake8 clean; clean-environment install verified</w:t>
             </w:r>
           </w:p>
         </w:tc>
@@ -4407,7 +4407,7 @@
       <w:r>
         <w:drawing>
           <wp:inline distT="0" distB="0" distL="0" distR="0">
-            <wp:extent cx="3657600" cy="2714625"/>
+            <wp:extent cx="3657600" cy="2209800"/>
             <wp:effectExtent t="0" r="0" b="0" l="0"/>
             <wp:docPr id="1" name="" descr="" title=""/>
             <wp:cNvGraphicFramePr>
@@ -4432,7 +4432,7 @@
                   <pic:spPr bwMode="auto">
                     <a:xfrm>
                       <a:off x="0" y="0"/>
-                      <a:ext cx="3657600" cy="2714625"/>
+                      <a:ext cx="3657600" cy="2209800"/>
                     </a:xfrm>
                     <a:prstGeom prst="rect">
                       <a:avLst/>
@@ -4458,7 +4458,7 @@
           <w:sz w:val="18"/>
           <w:szCs w:val="18"/>
         </w:rPr>
-        <w:t xml:space="preserve">Figure 11 - flake8 and pytest in a clean virtual environment: 50 passed, 97% coverage</w:t>
+        <w:t xml:space="preserve">Figure 11 - flake8 and pytest in a clean virtual environment: 50 passed, 96% coverage</w:t>
       </w:r>
     </w:p>
     <w:p>
@@ -5038,7 +5038,7 @@
       <w:r>
         <w:t xml:space="preserve">The workflow runs automatically on every push to main. The run history, job graphs, step logs and uploaded artifacts of every run are public on the repository's Actions page: </w:t>
       </w:r>
-      <w:hyperlink w:history="1" r:id="rId042ncxepigam2l3hkvnzi">
+      <w:hyperlink w:history="1" r:id="rIdthd0tjve8oww5bzjie0va">
         <w:r>
           <w:rPr>
             <w:rStyle w:val="Hyperlink"/>
@@ -5082,7 +5082,7 @@
       <w:r>
         <w:drawing>
           <wp:inline distT="0" distB="0" distL="0" distR="0">
-            <wp:extent cx="5667375" cy="2781300"/>
+            <wp:extent cx="5667375" cy="2238375"/>
             <wp:effectExtent t="0" r="0" b="0" l="0"/>
             <wp:docPr id="1" name="" descr="" title=""/>
             <wp:cNvGraphicFramePr>
@@ -5107,7 +5107,7 @@
                   <pic:spPr bwMode="auto">
                     <a:xfrm>
                       <a:off x="0" y="0"/>
-                      <a:ext cx="5667375" cy="2781300"/>
+                      <a:ext cx="5667375" cy="2238375"/>
                     </a:xfrm>
                     <a:prstGeom prst="rect">
                       <a:avLst/>

</xml_diff>